<commit_message>
SurakshaScan: DPDP readiness scanner for Educational Institutions
AICA Level 2 Capstone - CA Aditi Gulati, Batch 89 Gurugram. Scans website of an educational institution against the DPDP Act 2023 and DPDP Rules 2025, and produces a Word report, Excel workbook and HTML dashboard.
</commit_message>
<xml_diff>
--- a/AICA-L2-Batch-89-Aditi-Gulati/01_Project_Summary_Document/SurakshaScan_Project_Summary.docx
+++ b/AICA-L2-Batch-89-Aditi-Gulati/01_Project_Summary_Document/SurakshaScan_Project_Summary.docx
@@ -480,7 +480,7 @@
           <w:sz w:val="22"/>
           <w:szCs w:val="22"/>
         </w:rPr>
-        <w:t xml:space="preserve">33 obligations</w:t>
+        <w:t xml:space="preserve">25 obligations</w:t>
       </w:r>
       <w:r>
         <w:rPr>
@@ -498,15 +498,15 @@
           <w:sz w:val="22"/>
           <w:szCs w:val="22"/>
         </w:rPr>
-        <w:t xml:space="preserve">five surfaces</w:t>
-      </w:r>
-      <w:r>
-        <w:rPr>
-          <w:rFonts w:ascii="Calibri" w:cs="Calibri" w:eastAsia="Calibri" w:hAnsi="Calibri"/>
-          <w:sz w:val="22"/>
-          <w:szCs w:val="22"/>
-        </w:rPr>
-        <w:t xml:space="preserve">: the public website, the published privacy policy, the school's own social media posts, its core systems (ERP, accounts, learning platform), and a 39-line internal-practices working paper. It produces a scored Word report, an Excel workbook, a mobile-friendly HTML dashboard and a timestamped evidence file.</w:t>
+        <w:t xml:space="preserve">four surfaces</w:t>
+      </w:r>
+      <w:r>
+        <w:rPr>
+          <w:rFonts w:ascii="Calibri" w:cs="Calibri" w:eastAsia="Calibri" w:hAnsi="Calibri"/>
+          <w:sz w:val="22"/>
+          <w:szCs w:val="22"/>
+        </w:rPr>
+        <w:t xml:space="preserve">: the public website, the published privacy policy, supporting documents such as the admission form and consent slip, and a 26-line internal-practices working paper. It produces a scored Word report, an Excel workbook, a mobile-friendly HTML dashboard and a timestamped evidence file.</w:t>
       </w:r>
     </w:p>
     <w:p>
@@ -684,7 +684,7 @@
                 <w:sz w:val="19"/>
                 <w:szCs w:val="19"/>
               </w:rPr>
-              <w:t xml:space="preserve">33, across 8 domains, each with its provision and commencement date</w:t>
+              <w:t xml:space="preserve">25, across 7 domains, each with its provision and commencement date</w:t>
             </w:r>
           </w:p>
         </w:tc>
@@ -754,7 +754,7 @@
                 <w:sz w:val="19"/>
                 <w:szCs w:val="19"/>
               </w:rPr>
-              <w:t xml:space="preserve">Website · policy · social media · core systems · internal practices</w:t>
+              <w:t xml:space="preserve">Website · privacy policy · supporting documents · internal practices</w:t>
             </w:r>
           </w:p>
         </w:tc>
@@ -822,7 +822,7 @@
                 <w:sz w:val="19"/>
                 <w:szCs w:val="19"/>
               </w:rPr>
-              <w:t xml:space="preserve">39 lines across 7 tabs, audit working-paper conventions</w:t>
+              <w:t xml:space="preserve">26 lines across 5 tabs, audit working-paper conventions</w:t>
             </w:r>
           </w:p>
         </w:tc>
@@ -892,7 +892,7 @@
                 <w:sz w:val="19"/>
                 <w:szCs w:val="19"/>
               </w:rPr>
-              <w:t xml:space="preserve">About 8,250 lines of Python across 36 modules</w:t>
+              <w:t xml:space="preserve">About 5,800 lines of Python across 26 modules</w:t>
             </w:r>
           </w:p>
         </w:tc>
@@ -960,7 +960,7 @@
                 <w:sz w:val="19"/>
                 <w:szCs w:val="19"/>
               </w:rPr>
-              <w:t xml:space="preserve">87 automated tests, all passing, run offline against fixtures</w:t>
+              <w:t xml:space="preserve">42 automated tests, all passing, run offline against fixtures</w:t>
             </w:r>
           </w:p>
         </w:tc>
@@ -1106,15 +1106,15 @@
           <w:sz w:val="22"/>
           <w:szCs w:val="22"/>
         </w:rPr>
-        <w:t xml:space="preserve">Its data is spread thin. </w:t>
-      </w:r>
-      <w:r>
-        <w:rPr>
-          <w:rFonts w:ascii="Calibri" w:cs="Calibri" w:eastAsia="Calibri" w:hAnsi="Calibri"/>
-          <w:sz w:val="22"/>
-          <w:szCs w:val="22"/>
-        </w:rPr>
-        <w:t xml:space="preserve">Student records sit in the ERP; fee receipts in the accounts; coursework on a learning platform; photographs on Instagram; CCTV on a recorder in the office. No one person sees all of it.</w:t>
+        <w:t xml:space="preserve">Its website is its front door. </w:t>
+      </w:r>
+      <w:r>
+        <w:rPr>
+          <w:rFonts w:ascii="Calibri" w:cs="Calibri" w:eastAsia="Calibri" w:hAnsi="Calibri"/>
+          <w:sz w:val="22"/>
+          <w:szCs w:val="22"/>
+        </w:rPr>
+        <w:t xml:space="preserve">Admission enquiry forms, galleries of students, result boards and third-party scripts all sit on a public site that is usually built and forgotten by a vendor. It is the first thing a parent, or the Board, will look at.</w:t>
       </w:r>
     </w:p>
     <w:p>
@@ -1559,7 +1559,7 @@
                 <w:sz w:val="19"/>
                 <w:szCs w:val="19"/>
               </w:rPr>
-              <w:t xml:space="preserve">Social media</w:t>
+              <w:t xml:space="preserve">Documents</w:t>
             </w:r>
           </w:p>
         </w:tc>
@@ -1592,7 +1592,7 @@
                 <w:sz w:val="19"/>
                 <w:szCs w:val="19"/>
               </w:rPr>
-              <w:t xml:space="preserve">Posts naming a child with a class, roll numbers, boosted posts featuring children</w:t>
+              <w:t xml:space="preserve">Admission form, consent slip, CCTV signage</w:t>
             </w:r>
           </w:p>
         </w:tc>
@@ -1625,7 +1625,7 @@
                 <w:sz w:val="19"/>
                 <w:szCs w:val="19"/>
               </w:rPr>
-              <w:t xml:space="preserve">Only the school's own posts; captions analysed, never faces; never scraped</w:t>
+              <w:t xml:space="preserve">Read offline from a PDF text layer, or by a vision model with uncertainty flags</w:t>
             </w:r>
           </w:p>
         </w:tc>
@@ -1661,7 +1661,7 @@
                 <w:sz w:val="19"/>
                 <w:szCs w:val="19"/>
               </w:rPr>
-              <w:t xml:space="preserve">Core systems</w:t>
+              <w:t xml:space="preserve">Internal practices</w:t>
             </w:r>
           </w:p>
         </w:tc>
@@ -1695,7 +1695,7 @@
                 <w:sz w:val="19"/>
                 <w:szCs w:val="19"/>
               </w:rPr>
-              <w:t xml:space="preserve">What the ERP, accounts and learning platform actually hold</w:t>
+              <w:t xml:space="preserve">System register, vendor contracts, retention, breach procedure, media consent</w:t>
             </w:r>
           </w:p>
         </w:tc>
@@ -1729,108 +1729,7 @@
                 <w:sz w:val="19"/>
                 <w:szCs w:val="19"/>
               </w:rPr>
-              <w:t xml:space="preserve">Reads the shape of an export — column names and counts — never the data</w:t>
-            </w:r>
-          </w:p>
-        </w:tc>
-      </w:tr>
-      <w:tr>
-        <w:tc>
-          <w:tcPr>
-            <w:tcW w:type="dxa" w:w="1700"/>
-            <w:tcBorders>
-              <w:top w:val="single" w:color="D6DCE1" w:sz="4"/>
-              <w:left w:val="single" w:color="D6DCE1" w:sz="4"/>
-              <w:bottom w:val="single" w:color="D6DCE1" w:sz="4"/>
-              <w:right w:val="single" w:color="D6DCE1" w:sz="4"/>
-            </w:tcBorders>
-            <w:tcMar>
-              <w:top w:type="dxa" w:w="70"/>
-              <w:left w:type="dxa" w:w="110"/>
-              <w:bottom w:type="dxa" w:w="70"/>
-              <w:right w:type="dxa" w:w="110"/>
-            </w:tcMar>
-          </w:tcPr>
-          <w:p>
-            <w:pPr>
-              <w:spacing w:after="0" w:line="260"/>
-            </w:pPr>
-            <w:r>
-              <w:rPr>
-                <w:rFonts w:ascii="Calibri" w:cs="Calibri" w:eastAsia="Calibri" w:hAnsi="Calibri"/>
-                <w:b w:val="false"/>
-                <w:bCs w:val="false"/>
-                <w:color w:val="222222"/>
-                <w:sz w:val="19"/>
-                <w:szCs w:val="19"/>
-              </w:rPr>
-              <w:t xml:space="preserve">Internal practices</w:t>
-            </w:r>
-          </w:p>
-        </w:tc>
-        <w:tc>
-          <w:tcPr>
-            <w:tcW w:type="dxa" w:w="3700"/>
-            <w:tcBorders>
-              <w:top w:val="single" w:color="D6DCE1" w:sz="4"/>
-              <w:left w:val="single" w:color="D6DCE1" w:sz="4"/>
-              <w:bottom w:val="single" w:color="D6DCE1" w:sz="4"/>
-              <w:right w:val="single" w:color="D6DCE1" w:sz="4"/>
-            </w:tcBorders>
-            <w:tcMar>
-              <w:top w:type="dxa" w:w="70"/>
-              <w:left w:type="dxa" w:w="110"/>
-              <w:bottom w:type="dxa" w:w="70"/>
-              <w:right w:type="dxa" w:w="110"/>
-            </w:tcMar>
-          </w:tcPr>
-          <w:p>
-            <w:pPr>
-              <w:spacing w:after="0" w:line="260"/>
-            </w:pPr>
-            <w:r>
-              <w:rPr>
-                <w:rFonts w:ascii="Calibri" w:cs="Calibri" w:eastAsia="Calibri" w:hAnsi="Calibri"/>
-                <w:b w:val="false"/>
-                <w:bCs w:val="false"/>
-                <w:color w:val="222222"/>
-                <w:sz w:val="19"/>
-                <w:szCs w:val="19"/>
-              </w:rPr>
-              <w:t xml:space="preserve">Vendor contracts, retention, breach procedure, media consent</w:t>
-            </w:r>
-          </w:p>
-        </w:tc>
-        <w:tc>
-          <w:tcPr>
-            <w:tcW w:type="dxa" w:w="3626"/>
-            <w:tcBorders>
-              <w:top w:val="single" w:color="D6DCE1" w:sz="4"/>
-              <w:left w:val="single" w:color="D6DCE1" w:sz="4"/>
-              <w:bottom w:val="single" w:color="D6DCE1" w:sz="4"/>
-              <w:right w:val="single" w:color="D6DCE1" w:sz="4"/>
-            </w:tcBorders>
-            <w:tcMar>
-              <w:top w:type="dxa" w:w="70"/>
-              <w:left w:type="dxa" w:w="110"/>
-              <w:bottom w:type="dxa" w:w="70"/>
-              <w:right w:type="dxa" w:w="110"/>
-            </w:tcMar>
-          </w:tcPr>
-          <w:p>
-            <w:pPr>
-              <w:spacing w:after="0" w:line="260"/>
-            </w:pPr>
-            <w:r>
-              <w:rPr>
-                <w:rFonts w:ascii="Calibri" w:cs="Calibri" w:eastAsia="Calibri" w:hAnsi="Calibri"/>
-                <w:b w:val="false"/>
-                <w:bCs w:val="false"/>
-                <w:color w:val="222222"/>
-                <w:sz w:val="19"/>
-                <w:szCs w:val="19"/>
-              </w:rPr>
-              <w:t xml:space="preserve">A 39-line working paper with mandatory reviewer and neutral remarks</w:t>
+              <w:t xml:space="preserve">A 26-line working paper with mandatory reviewer and neutral remarks</w:t>
             </w:r>
           </w:p>
         </w:tc>
@@ -1894,15 +1793,15 @@
           <w:sz w:val="22"/>
           <w:szCs w:val="22"/>
         </w:rPr>
-        <w:t xml:space="preserve">9/100 (Critical)</w:t>
-      </w:r>
-      <w:r>
-        <w:rPr>
-          <w:rFonts w:ascii="Calibri" w:cs="Calibri" w:eastAsia="Calibri" w:hAnsi="Calibri"/>
-          <w:sz w:val="22"/>
-          <w:szCs w:val="22"/>
-        </w:rPr>
-        <w:t xml:space="preserve">, with 58% of the catalogue assessable. It always reports coverage beside the score: a high score over a thin scan is not a well-run school.</w:t>
+        <w:t xml:space="preserve">8/100 (Critical)</w:t>
+      </w:r>
+      <w:r>
+        <w:rPr>
+          <w:rFonts w:ascii="Calibri" w:cs="Calibri" w:eastAsia="Calibri" w:hAnsi="Calibri"/>
+          <w:sz w:val="22"/>
+          <w:szCs w:val="22"/>
+        </w:rPr>
+        <w:t xml:space="preserve">, with 62% of the catalogue assessable. It always reports coverage beside the score: a high score over a thin scan is not a well-run school.</w:t>
       </w:r>
     </w:p>
     <w:p>
@@ -2095,15 +1994,15 @@
           <w:sz w:val="22"/>
           <w:szCs w:val="22"/>
         </w:rPr>
-        <w:t xml:space="preserve">It reads the shape of the data, never the data. </w:t>
-      </w:r>
-      <w:r>
-        <w:rPr>
-          <w:rFonts w:ascii="Calibri" w:cs="Calibri" w:eastAsia="Calibri" w:hAnsi="Calibri"/>
-          <w:sz w:val="22"/>
-          <w:szCs w:val="22"/>
-        </w:rPr>
-        <w:t xml:space="preserve">ERP and accounts exports yield column names, categories and counts only. A compliance tool that accumulated every school's student database would be a worse problem than the one it finds.</w:t>
+        <w:t xml:space="preserve">It reads public pages only, politely. </w:t>
+      </w:r>
+      <w:r>
+        <w:rPr>
+          <w:rFonts w:ascii="Calibri" w:cs="Calibri" w:eastAsia="Calibri" w:hAnsi="Calibri"/>
+          <w:sz w:val="22"/>
+          <w:szCs w:val="22"/>
+        </w:rPr>
+        <w:t xml:space="preserve">The crawler obeys robots.txt, rate-limits itself, never logs in and never submits a form. It records what it saw, not the personal data of anyone on the page.</w:t>
       </w:r>
     </w:p>
     <w:p>
@@ -2123,15 +2022,15 @@
           <w:sz w:val="22"/>
           <w:szCs w:val="22"/>
         </w:rPr>
-        <w:t xml:space="preserve">It never scrapes social media. </w:t>
-      </w:r>
-      <w:r>
-        <w:rPr>
-          <w:rFonts w:ascii="Calibri" w:cs="Calibri" w:eastAsia="Calibri" w:hAnsi="Calibri"/>
-          <w:sz w:val="22"/>
-          <w:szCs w:val="22"/>
-        </w:rPr>
-        <w:t xml:space="preserve">It reads only the school's own posts, through an export the school supplies or screenshots. Captions are analysed; no face recognition is ever performed on a child.</w:t>
+        <w:t xml:space="preserve">It keeps secrets out of the evidence. </w:t>
+      </w:r>
+      <w:r>
+        <w:rPr>
+          <w:rFonts w:ascii="Calibri" w:cs="Calibri" w:eastAsia="Calibri" w:hAnsi="Calibri"/>
+          <w:sz w:val="22"/>
+          <w:szCs w:val="22"/>
+        </w:rPr>
+        <w:t xml:space="preserve">API keys and tokens are redacted before the evidence file is written, and every report names the evidence file it came from.</w:t>
       </w:r>
     </w:p>
     <w:p>
@@ -2184,7 +2083,7 @@
           <w:sz w:val="22"/>
           <w:szCs w:val="22"/>
         </w:rPr>
-        <w:t xml:space="preserve">Section 3(c)(ii) exempts publicly available data only where it was made public by the Data Principal, or by someone under a legal obligation to publish it. A school posting a child's photograph is neither. So that photograph stays fully within the Act, and reading another school's feed without consent would make the reviewer a </w:t>
+        <w:t xml:space="preserve">Section 3(c)(ii) exempts publicly available data only where it was made public by the Data Principal, or by someone under a legal obligation to publish it. A school publishing a child's photograph on its website is neither. So that photograph stays fully within the Act, and a reviewer collecting it without the school's consent would become a </w:t>
       </w:r>
       <w:r>
         <w:rPr>
@@ -2724,7 +2623,7 @@
                 <w:sz w:val="19"/>
                 <w:szCs w:val="19"/>
               </w:rPr>
-              <w:t xml:space="preserve">8</w:t>
+              <w:t xml:space="preserve">4</w:t>
             </w:r>
           </w:p>
         </w:tc>
@@ -2757,7 +2656,7 @@
                 <w:sz w:val="19"/>
                 <w:szCs w:val="19"/>
               </w:rPr>
-              <w:t xml:space="preserve">48</w:t>
+              <w:t xml:space="preserve">26</w:t>
             </w:r>
           </w:p>
         </w:tc>
@@ -2790,7 +2689,7 @@
                 <w:sz w:val="19"/>
                 <w:szCs w:val="19"/>
               </w:rPr>
-              <w:t xml:space="preserve">Verifiable parental consent; s.9(3) tracking ban; social media; media consent</w:t>
+              <w:t xml:space="preserve">Verifiable parental consent; s.9(3) tracking ban; Fourth Schedule boundary; media consent</w:t>
             </w:r>
           </w:p>
         </w:tc>
@@ -3235,7 +3134,7 @@
                 <w:sz w:val="19"/>
                 <w:szCs w:val="19"/>
               </w:rPr>
-              <w:t xml:space="preserve">Core systems</w:t>
+              <w:t xml:space="preserve">Processors and third parties</w:t>
             </w:r>
           </w:p>
         </w:tc>
@@ -3268,7 +3167,7 @@
                 <w:sz w:val="19"/>
                 <w:szCs w:val="19"/>
               </w:rPr>
-              <w:t xml:space="preserve">4</w:t>
+              <w:t xml:space="preserve">3</w:t>
             </w:r>
           </w:p>
         </w:tc>
@@ -3301,7 +3200,7 @@
                 <w:sz w:val="19"/>
                 <w:szCs w:val="19"/>
               </w:rPr>
-              <w:t xml:space="preserve">23</w:t>
+              <w:t xml:space="preserve">14</w:t>
             </w:r>
           </w:p>
         </w:tc>
@@ -3314,144 +3213,6 @@
               <w:bottom w:val="single" w:color="D6DCE1" w:sz="4"/>
               <w:right w:val="single" w:color="D6DCE1" w:sz="4"/>
             </w:tcBorders>
-            <w:tcMar>
-              <w:top w:type="dxa" w:w="70"/>
-              <w:left w:type="dxa" w:w="110"/>
-              <w:bottom w:type="dxa" w:w="70"/>
-              <w:right w:type="dxa" w:w="110"/>
-            </w:tcMar>
-          </w:tcPr>
-          <w:p>
-            <w:pPr>
-              <w:spacing w:after="0" w:line="260"/>
-            </w:pPr>
-            <w:r>
-              <w:rPr>
-                <w:rFonts w:ascii="Calibri" w:cs="Calibri" w:eastAsia="Calibri" w:hAnsi="Calibri"/>
-                <w:b w:val="false"/>
-                <w:bCs w:val="false"/>
-                <w:color w:val="222222"/>
-                <w:sz w:val="19"/>
-                <w:szCs w:val="19"/>
-              </w:rPr>
-              <w:t xml:space="preserve">ERP minimisation; erasing leavers; accounts retention conflict; LMS</w:t>
-            </w:r>
-          </w:p>
-        </w:tc>
-      </w:tr>
-      <w:tr>
-        <w:tc>
-          <w:tcPr>
-            <w:tcW w:type="dxa" w:w="2300"/>
-            <w:tcBorders>
-              <w:top w:val="single" w:color="D6DCE1" w:sz="4"/>
-              <w:left w:val="single" w:color="D6DCE1" w:sz="4"/>
-              <w:bottom w:val="single" w:color="D6DCE1" w:sz="4"/>
-              <w:right w:val="single" w:color="D6DCE1" w:sz="4"/>
-            </w:tcBorders>
-            <w:shd w:fill="F6F8FA" w:color="auto" w:val="clear"/>
-            <w:tcMar>
-              <w:top w:type="dxa" w:w="70"/>
-              <w:left w:type="dxa" w:w="110"/>
-              <w:bottom w:type="dxa" w:w="70"/>
-              <w:right w:type="dxa" w:w="110"/>
-            </w:tcMar>
-          </w:tcPr>
-          <w:p>
-            <w:pPr>
-              <w:spacing w:after="0" w:line="260"/>
-            </w:pPr>
-            <w:r>
-              <w:rPr>
-                <w:rFonts w:ascii="Calibri" w:cs="Calibri" w:eastAsia="Calibri" w:hAnsi="Calibri"/>
-                <w:b w:val="false"/>
-                <w:bCs w:val="false"/>
-                <w:color w:val="222222"/>
-                <w:sz w:val="19"/>
-                <w:szCs w:val="19"/>
-              </w:rPr>
-              <w:t xml:space="preserve">Processors and third parties</w:t>
-            </w:r>
-          </w:p>
-        </w:tc>
-        <w:tc>
-          <w:tcPr>
-            <w:tcW w:type="dxa" w:w="1350"/>
-            <w:tcBorders>
-              <w:top w:val="single" w:color="D6DCE1" w:sz="4"/>
-              <w:left w:val="single" w:color="D6DCE1" w:sz="4"/>
-              <w:bottom w:val="single" w:color="D6DCE1" w:sz="4"/>
-              <w:right w:val="single" w:color="D6DCE1" w:sz="4"/>
-            </w:tcBorders>
-            <w:shd w:fill="F6F8FA" w:color="auto" w:val="clear"/>
-            <w:tcMar>
-              <w:top w:type="dxa" w:w="70"/>
-              <w:left w:type="dxa" w:w="110"/>
-              <w:bottom w:type="dxa" w:w="70"/>
-              <w:right w:type="dxa" w:w="110"/>
-            </w:tcMar>
-          </w:tcPr>
-          <w:p>
-            <w:pPr>
-              <w:spacing w:after="0" w:line="260"/>
-            </w:pPr>
-            <w:r>
-              <w:rPr>
-                <w:rFonts w:ascii="Calibri" w:cs="Calibri" w:eastAsia="Calibri" w:hAnsi="Calibri"/>
-                <w:b w:val="false"/>
-                <w:bCs w:val="false"/>
-                <w:color w:val="222222"/>
-                <w:sz w:val="19"/>
-                <w:szCs w:val="19"/>
-              </w:rPr>
-              <w:t xml:space="preserve">3</w:t>
-            </w:r>
-          </w:p>
-        </w:tc>
-        <w:tc>
-          <w:tcPr>
-            <w:tcW w:type="dxa" w:w="950"/>
-            <w:tcBorders>
-              <w:top w:val="single" w:color="D6DCE1" w:sz="4"/>
-              <w:left w:val="single" w:color="D6DCE1" w:sz="4"/>
-              <w:bottom w:val="single" w:color="D6DCE1" w:sz="4"/>
-              <w:right w:val="single" w:color="D6DCE1" w:sz="4"/>
-            </w:tcBorders>
-            <w:shd w:fill="F6F8FA" w:color="auto" w:val="clear"/>
-            <w:tcMar>
-              <w:top w:type="dxa" w:w="70"/>
-              <w:left w:type="dxa" w:w="110"/>
-              <w:bottom w:type="dxa" w:w="70"/>
-              <w:right w:type="dxa" w:w="110"/>
-            </w:tcMar>
-          </w:tcPr>
-          <w:p>
-            <w:pPr>
-              <w:spacing w:after="0" w:line="260"/>
-            </w:pPr>
-            <w:r>
-              <w:rPr>
-                <w:rFonts w:ascii="Calibri" w:cs="Calibri" w:eastAsia="Calibri" w:hAnsi="Calibri"/>
-                <w:b w:val="false"/>
-                <w:bCs w:val="false"/>
-                <w:color w:val="222222"/>
-                <w:sz w:val="19"/>
-                <w:szCs w:val="19"/>
-              </w:rPr>
-              <w:t xml:space="preserve">14</w:t>
-            </w:r>
-          </w:p>
-        </w:tc>
-        <w:tc>
-          <w:tcPr>
-            <w:tcW w:type="dxa" w:w="4426"/>
-            <w:tcBorders>
-              <w:top w:val="single" w:color="D6DCE1" w:sz="4"/>
-              <w:left w:val="single" w:color="D6DCE1" w:sz="4"/>
-              <w:bottom w:val="single" w:color="D6DCE1" w:sz="4"/>
-              <w:right w:val="single" w:color="D6DCE1" w:sz="4"/>
-            </w:tcBorders>
-            <w:shd w:fill="F6F8FA" w:color="auto" w:val="clear"/>
             <w:tcMar>
               <w:top w:type="dxa" w:w="70"/>
               <w:left w:type="dxa" w:w="110"/>
@@ -4283,7 +4044,7 @@
                 <w:sz w:val="19"/>
                 <w:szCs w:val="19"/>
               </w:rPr>
-              <w:t xml:space="preserve">Review of admission forms, consent slips and post screenshots with uncertainty flags; the two-perspective panel for every contested finding</w:t>
+              <w:t xml:space="preserve">Review of admission forms, consent slips and signage photographs with uncertainty flags; the two-perspective panel for every contested finding</w:t>
             </w:r>
           </w:p>
         </w:tc>
@@ -4556,7 +4317,7 @@
                 <w:sz w:val="19"/>
                 <w:szCs w:val="19"/>
               </w:rPr>
-              <w:t xml:space="preserve">MCP; TallyPrime; workflow automation</w:t>
+              <w:t xml:space="preserve">MCP; workflow automation</w:t>
             </w:r>
           </w:p>
         </w:tc>
@@ -4589,7 +4350,7 @@
                 <w:sz w:val="19"/>
                 <w:szCs w:val="19"/>
               </w:rPr>
-              <w:t xml:space="preserve">An MCP server, read-only by default; a read-only TallyPrime ledger check over the local port; an n8n trigger → action → review → output workflow</w:t>
+              <w:t xml:space="preserve">An MCP server, read-only by default, with write tools only behind an explicit switch and a fixed folder; an n8n trigger → action → review → output workflow</w:t>
             </w:r>
           </w:p>
         </w:tc>
@@ -4606,6 +4367,29 @@
           <w:szCs w:val="22"/>
         </w:rPr>
         <w:t xml:space="preserve"/>
+      </w:r>
+    </w:p>
+    <w:p>
+      <w:pPr>
+        <w:spacing w:after="120" w:line="290"/>
+      </w:pPr>
+      <w:r>
+        <w:rPr>
+          <w:rFonts w:ascii="Calibri" w:cs="Calibri" w:eastAsia="Calibri" w:hAnsi="Calibri"/>
+          <w:b/>
+          <w:bCs/>
+          <w:sz w:val="22"/>
+          <w:szCs w:val="22"/>
+        </w:rPr>
+        <w:t xml:space="preserve">Deliberately held back. </w:t>
+      </w:r>
+      <w:r>
+        <w:rPr>
+          <w:rFonts w:ascii="Calibri" w:cs="Calibri" w:eastAsia="Calibri" w:hAnsi="Calibri"/>
+          <w:sz w:val="22"/>
+          <w:szCs w:val="22"/>
+        </w:rPr>
+        <w:t xml:space="preserve">A reader for the school's own social media posts and a read-only check of ERP, fee-software and TallyPrime records were built and tested during development. Real exports arrived in too many formats to make them reliable in the time available, so they were removed from the capstone build and archived for a later hackathon version. The capstone does one thing well: it scans the school website and produces the reports.</w:t>
       </w:r>
     </w:p>
     <w:p>
@@ -4826,7 +4610,7 @@
                 <w:sz w:val="19"/>
                 <w:szCs w:val="19"/>
               </w:rPr>
-              <w:t xml:space="preserve">Tkinter desktop app (8 tabs) · command line · MCP server · n8n workflow</w:t>
+              <w:t xml:space="preserve">Tkinter desktop app (6 tabs) · command line · MCP server · n8n workflow</w:t>
             </w:r>
           </w:p>
         </w:tc>
@@ -4896,7 +4680,7 @@
                 <w:sz w:val="19"/>
                 <w:szCs w:val="19"/>
               </w:rPr>
-              <w:t xml:space="preserve">Website crawler · policy reader · social media reader · ERP/LMS export analyser · TallyPrime reader · document vision</w:t>
+              <w:t xml:space="preserve">Website crawler · policy finder and reader · tracker detector · form and field catalogue · document vision</w:t>
             </w:r>
           </w:p>
         </w:tc>
@@ -5210,15 +4994,15 @@
           <w:sz w:val="22"/>
           <w:szCs w:val="22"/>
         </w:rPr>
-        <w:t xml:space="preserve">87 automated tests</w:t>
-      </w:r>
-      <w:r>
-        <w:rPr>
-          <w:rFonts w:ascii="Calibri" w:cs="Calibri" w:eastAsia="Calibri" w:hAnsi="Calibri"/>
-          <w:sz w:val="22"/>
-          <w:szCs w:val="22"/>
-        </w:rPr>
-        <w:t xml:space="preserve">, all passing, run entirely offline against fixture websites and exports. They cover the scanner, the rules engine, scoring, the AI guards, every report, the social and core-systems modules, the authorisation requirement, and a headless build of the desktop window.</w:t>
+        <w:t xml:space="preserve">42 automated tests</w:t>
+      </w:r>
+      <w:r>
+        <w:rPr>
+          <w:rFonts w:ascii="Calibri" w:cs="Calibri" w:eastAsia="Calibri" w:hAnsi="Calibri"/>
+          <w:sz w:val="22"/>
+          <w:szCs w:val="22"/>
+        </w:rPr>
+        <w:t xml:space="preserve">, all passing, run entirely offline against fixture websites. They cover the scanner, the rules engine, scoring, the AI guards, every report, the authorisation requirement, the capstone scope itself, and a headless build of the desktop window.</w:t>
       </w:r>
     </w:p>
     <w:p>
@@ -5249,7 +5033,7 @@
           <w:sz w:val="22"/>
           <w:szCs w:val="22"/>
         </w:rPr>
-        <w:t xml:space="preserve">the AI layer cannot assert an obligation is met without quoting real text;</w:t>
+        <w:t xml:space="preserve">the AI layer cannot assert an obligation is met without quoting real text, or invent an obligation;</w:t>
       </w:r>
     </w:p>
     <w:p>
@@ -5267,7 +5051,7 @@
           <w:sz w:val="22"/>
           <w:szCs w:val="22"/>
         </w:rPr>
-        <w:t xml:space="preserve">no child's name, Aadhaar number or address can reach the evidence file;</w:t>
+        <w:t xml:space="preserve">no API key or token can reach the evidence file;</w:t>
       </w:r>
     </w:p>
     <w:p>
@@ -5285,7 +5069,7 @@
           <w:sz w:val="22"/>
           <w:szCs w:val="22"/>
         </w:rPr>
-        <w:t xml:space="preserve">no scraping code can appear in the social media module;</w:t>
+        <w:t xml:space="preserve">no web page is fetched before the authorisation is checked;</w:t>
       </w:r>
     </w:p>
     <w:p>
@@ -5303,25 +5087,7 @@
           <w:sz w:val="22"/>
           <w:szCs w:val="22"/>
         </w:rPr>
-        <w:t xml:space="preserve">the TallyPrime request can never contain Import, Alter, Delete or Create;</w:t>
-      </w:r>
-    </w:p>
-    <w:p>
-      <w:pPr>
-        <w:pStyle w:val="ListParagraph"/>
-        <w:numPr>
-          <w:ilvl w:val="0"/>
-          <w:numId w:val="2"/>
-        </w:numPr>
-        <w:spacing w:after="70" w:line="280"/>
-      </w:pPr>
-      <w:r>
-        <w:rPr>
-          <w:rFonts w:ascii="Calibri" w:cs="Calibri" w:eastAsia="Calibri" w:hAnsi="Calibri"/>
-          <w:sz w:val="22"/>
-          <w:szCs w:val="22"/>
-        </w:rPr>
-        <w:t xml:space="preserve">no web page is fetched before the authorisation is checked.</w:t>
+        <w:t xml:space="preserve">a working-paper line cannot be marked Completed without a reviewer.</w:t>
       </w:r>
     </w:p>
     <w:p>
@@ -5346,7 +5112,7 @@
           <w:sz w:val="22"/>
           <w:szCs w:val="22"/>
         </w:rPr>
-        <w:t xml:space="preserve">Using the tool on real data surfaced defects the unit tests did not. A Meta pixel matching three signatures was being counted three times. Three argument panels were word-for-word identical. Twice, a whole module's results were computed and then silently dropped before reaching the report — both caught by the offline self-test printing an empty tick box. The Ctrl+V paste key was bound to a widget that never receives keyboard focus. Each was fixed and given a regression test.</w:t>
+        <w:t xml:space="preserve">Using the tool on real school websites surfaced defects the unit tests did not. A Meta pixel matching three signatures was being counted three times. Three argument panels were word-for-word identical. The policy finder looked for policy pages relative to the current page rather than the site root, and a retry pause was hanging the scan. Each was fixed and given a regression test. Testing also showed that social media and ERP exports were not yet reliable across formats — which is why that part was held back rather than shipped half-working.</w:t>
       </w:r>
     </w:p>
     <w:p>
@@ -5581,7 +5347,7 @@
                 <w:sz w:val="19"/>
                 <w:szCs w:val="19"/>
               </w:rPr>
-              <w:t xml:space="preserve">Overview with score and charts; prioritised actions; findings by obligation; two-perspective panels; working paper; social media; core systems; evidence appendix</w:t>
+              <w:t xml:space="preserve">Overview with score and charts; prioritised actions; findings by obligation; two-perspective panels; working paper; documents; chatbots and AI layer; evidence appendix</w:t>
             </w:r>
           </w:p>
         </w:tc>
@@ -5953,15 +5719,15 @@
           <w:sz w:val="22"/>
           <w:szCs w:val="22"/>
         </w:rPr>
-        <w:t xml:space="preserve">Hindi captions. </w:t>
-      </w:r>
-      <w:r>
-        <w:rPr>
-          <w:rFonts w:ascii="Calibri" w:cs="Calibri" w:eastAsia="Calibri" w:hAnsi="Calibri"/>
-          <w:sz w:val="22"/>
-          <w:szCs w:val="22"/>
-        </w:rPr>
-        <w:t xml:space="preserve">Devanagari has no capital letters, so names cannot be extracted from Hindi posts the way they are from English ones. Such posts are flagged for a person to read rather than guessed at.</w:t>
+        <w:t xml:space="preserve">Website only. </w:t>
+      </w:r>
+      <w:r>
+        <w:rPr>
+          <w:rFonts w:ascii="Calibri" w:cs="Calibri" w:eastAsia="Calibri" w:hAnsi="Calibri"/>
+          <w:sz w:val="22"/>
+          <w:szCs w:val="22"/>
+        </w:rPr>
+        <w:t xml:space="preserve">Social media and the school's ERP, fee software and accounts are where much of its children's data actually lives. This build does not review them; the report says so rather than implying a clean result.</w:t>
       </w:r>
     </w:p>
     <w:p>
@@ -6044,10 +5810,20 @@
       <w:r>
         <w:rPr>
           <w:rFonts w:ascii="Calibri" w:cs="Calibri" w:eastAsia="Calibri" w:hAnsi="Calibri"/>
-          <w:sz w:val="22"/>
-          <w:szCs w:val="22"/>
-        </w:rPr>
-        <w:t xml:space="preserve">Name recognition for Devanagari captions, reviewed against a labelled sample before use.</w:t>
+          <w:b/>
+          <w:bCs/>
+          <w:sz w:val="22"/>
+          <w:szCs w:val="22"/>
+        </w:rPr>
+        <w:t xml:space="preserve">Hackathon build: </w:t>
+      </w:r>
+      <w:r>
+        <w:rPr>
+          <w:rFonts w:ascii="Calibri" w:cs="Calibri" w:eastAsia="Calibri" w:hAnsi="Calibri"/>
+          <w:sz w:val="22"/>
+          <w:szCs w:val="22"/>
+        </w:rPr>
+        <w:t xml:space="preserve">review of the school's own social media posts (never scraped, captions only, never faces), and a read-only check of the ERP, fee software and TallyPrime masters that reads column structure, never the children in it.</w:t>
       </w:r>
     </w:p>
     <w:p>
@@ -6088,24 +5864,6 @@
     </w:p>
     <w:p>
       <w:pPr>
-        <w:pStyle w:val="ListParagraph"/>
-        <w:numPr>
-          <w:ilvl w:val="0"/>
-          <w:numId w:val="2"/>
-        </w:numPr>
-        <w:spacing w:after="70" w:line="280"/>
-      </w:pPr>
-      <w:r>
-        <w:rPr>
-          <w:rFonts w:ascii="Calibri" w:cs="Calibri" w:eastAsia="Calibri" w:hAnsi="Calibri"/>
-          <w:sz w:val="22"/>
-          <w:szCs w:val="22"/>
-        </w:rPr>
-        <w:t xml:space="preserve">Connectors for the ERP products most common in Indian schools, reading structure only.</w:t>
-      </w:r>
-    </w:p>
-    <w:p>
-      <w:pPr>
         <w:pStyle w:val="Heading1"/>
         <w:spacing w:after="160" w:before="360"/>
       </w:pPr>
@@ -6249,7 +6007,7 @@
           <w:sz w:val="22"/>
           <w:szCs w:val="22"/>
         </w:rPr>
-        <w:t xml:space="preserve">The self-test scans the bundled demonstration school, writes all three reports and checks eight findings. If it prints "Self-test passed", the installation works.</w:t>
+        <w:t xml:space="preserve">The self-test scans the bundled demonstration school, writes all three reports and checks six findings. If it prints "Self-test passed", the installation works.</w:t>
       </w:r>
     </w:p>
     <w:p>
@@ -6554,7 +6312,7 @@
                 <w:sz w:val="19"/>
                 <w:szCs w:val="19"/>
               </w:rPr>
-              <w:t xml:space="preserve">Sample inputs (ERP, learning platform, social media, Tally, website) and outputs (Word, Excel, dashboard, evidence file)</w:t>
+              <w:t xml:space="preserve">A sample school website, and the outputs SurakshaScan produced from it (Word, Excel, dashboard, evidence file)</w:t>
             </w:r>
           </w:p>
         </w:tc>

</xml_diff>